<commit_message>
feat(thiqqah): single-source letterhead brand (JSON + RUN-LETTERHEAD)
- thiqqah-brand.json drives HTML, embed.js, docx, and local QR PNG
- letterhead-a4-print.html loads thiqqah-brand.embed.js; no external QR API
- Python build syncs all artifacts from one edit

Made-with: Cursor
</commit_message>
<xml_diff>
--- a/thiqqah-site/letterhead-thiqqah.docx
+++ b/thiqqah-site/letterhead-thiqqah.docx
@@ -258,10 +258,10 @@
               <w:noProof/>
             </w:rPr>
             <w:drawing>
-              <wp:inline distT="0" distB="0" distL="0" distR="0" wp14:anchorId="4D862867" wp14:editId="2EC8E304">
+              <wp:inline distT="0" distB="0" distL="0" distR="0" wp14:anchorId="7720BF54" wp14:editId="3E590449">
                 <wp:extent cx="522000" cy="522000"/>
                 <wp:effectExtent l="0" t="0" r="0" b="0"/>
-                <wp:docPr id="161791134" name="Picture 1"/>
+                <wp:docPr id="923359931" name="Picture 1"/>
                 <wp:cNvGraphicFramePr>
                   <a:graphicFrameLocks xmlns:a="http://schemas.openxmlformats.org/drawingml/2006/main" noChangeAspect="1"/>
                 </wp:cNvGraphicFramePr>
@@ -336,16 +336,16 @@
         <w:noProof/>
       </w:rPr>
       <w:drawing>
-        <wp:inline distT="0" distB="0" distL="0" distR="0" wp14:anchorId="3AA52965" wp14:editId="4BDCEE7A">
+        <wp:inline distT="0" distB="0" distL="0" distR="0" wp14:anchorId="77A783F9" wp14:editId="5BC12010">
           <wp:extent cx="3048000" cy="3048000"/>
           <wp:effectExtent l="0" t="0" r="0" b="0"/>
-          <wp:docPr id="1720748673" name="ThiqqahWaterMark"/>
+          <wp:docPr id="234636492" name="ThiqqahWaterMark"/>
           <wp:cNvGraphicFramePr/>
           <a:graphic xmlns:a="http://schemas.openxmlformats.org/drawingml/2006/main">
             <a:graphicData uri="http://schemas.openxmlformats.org/drawingml/2006/picture">
               <pic:pic xmlns:pic="http://schemas.openxmlformats.org/drawingml/2006/picture">
                 <pic:nvPicPr>
-                  <pic:cNvPr id="1720748673" name="ThiqqahWaterMark"/>
+                  <pic:cNvPr id="234636492" name="ThiqqahWaterMark"/>
                   <pic:cNvPicPr/>
                 </pic:nvPicPr>
                 <pic:blipFill>
@@ -730,8 +730,8 @@
               <w:noProof/>
             </w:rPr>
             <w:drawing>
-              <wp:inline distT="0" distB="0" distL="0" distR="0" wp14:anchorId="637993DB" wp14:editId="4A2A22CE">
-                <wp:extent cx="1128000" cy="798633"/>
+              <wp:inline distT="0" distB="0" distL="0" distR="0" wp14:anchorId="41854603" wp14:editId="30DBB0F7">
+                <wp:extent cx="1128000" cy="251156"/>
                 <wp:effectExtent l="0" t="0" r="0" b="0"/>
                 <wp:docPr id="1" name="Picture 1"/>
                 <wp:cNvGraphicFramePr>
@@ -741,7 +741,7 @@
                   <a:graphicData uri="http://schemas.openxmlformats.org/drawingml/2006/picture">
                     <pic:pic xmlns:pic="http://schemas.openxmlformats.org/drawingml/2006/picture">
                       <pic:nvPicPr>
-                        <pic:cNvPr id="0" name="thiqqah-logo.png"/>
+                        <pic:cNvPr id="0" name="thiqqah-logo-emblem.png"/>
                         <pic:cNvPicPr/>
                       </pic:nvPicPr>
                       <pic:blipFill>
@@ -753,7 +753,7 @@
                       <pic:spPr>
                         <a:xfrm>
                           <a:off x="0" y="0"/>
-                          <a:ext cx="1128000" cy="798633"/>
+                          <a:ext cx="1128000" cy="251156"/>
                         </a:xfrm>
                         <a:prstGeom prst="rect">
                           <a:avLst/>
@@ -965,31 +965,31 @@
       </w:rPr>
     </w:lvl>
   </w:abstractNum>
-  <w:num w:numId="1" w16cid:durableId="1809543049">
+  <w:num w:numId="1" w16cid:durableId="584342210">
     <w:abstractNumId w:val="8"/>
   </w:num>
-  <w:num w:numId="2" w16cid:durableId="129128232">
+  <w:num w:numId="2" w16cid:durableId="1047215494">
     <w:abstractNumId w:val="6"/>
   </w:num>
-  <w:num w:numId="3" w16cid:durableId="1457211796">
+  <w:num w:numId="3" w16cid:durableId="1046370754">
     <w:abstractNumId w:val="5"/>
   </w:num>
-  <w:num w:numId="4" w16cid:durableId="1532374823">
+  <w:num w:numId="4" w16cid:durableId="374895118">
     <w:abstractNumId w:val="4"/>
   </w:num>
-  <w:num w:numId="5" w16cid:durableId="1940486214">
+  <w:num w:numId="5" w16cid:durableId="177548890">
     <w:abstractNumId w:val="7"/>
   </w:num>
-  <w:num w:numId="6" w16cid:durableId="1611355467">
+  <w:num w:numId="6" w16cid:durableId="4796259">
     <w:abstractNumId w:val="3"/>
   </w:num>
-  <w:num w:numId="7" w16cid:durableId="1580214971">
+  <w:num w:numId="7" w16cid:durableId="211507291">
     <w:abstractNumId w:val="2"/>
   </w:num>
-  <w:num w:numId="8" w16cid:durableId="992375474">
+  <w:num w:numId="8" w16cid:durableId="127624574">
     <w:abstractNumId w:val="1"/>
   </w:num>
-  <w:num w:numId="9" w16cid:durableId="1928222272">
+  <w:num w:numId="9" w16cid:durableId="1582329316">
     <w:abstractNumId w:val="0"/>
   </w:num>
 </w:numbering>

</xml_diff>

<commit_message>
chore: letterhead build via npm run letterhead:thiqqah (no user steps)
- RUN-LETTERHEAD.cmd delegates to npm script
- soften on-page hint; fix Arabic wording

Made-with: Cursor
</commit_message>
<xml_diff>
--- a/thiqqah-site/letterhead-thiqqah.docx
+++ b/thiqqah-site/letterhead-thiqqah.docx
@@ -258,10 +258,10 @@
               <w:noProof/>
             </w:rPr>
             <w:drawing>
-              <wp:inline distT="0" distB="0" distL="0" distR="0" wp14:anchorId="7720BF54" wp14:editId="3E590449">
+              <wp:inline distT="0" distB="0" distL="0" distR="0" wp14:anchorId="3F6A83DE" wp14:editId="7451ACA5">
                 <wp:extent cx="522000" cy="522000"/>
                 <wp:effectExtent l="0" t="0" r="0" b="0"/>
-                <wp:docPr id="923359931" name="Picture 1"/>
+                <wp:docPr id="602565931" name="Picture 1"/>
                 <wp:cNvGraphicFramePr>
                   <a:graphicFrameLocks xmlns:a="http://schemas.openxmlformats.org/drawingml/2006/main" noChangeAspect="1"/>
                 </wp:cNvGraphicFramePr>
@@ -336,16 +336,16 @@
         <w:noProof/>
       </w:rPr>
       <w:drawing>
-        <wp:inline distT="0" distB="0" distL="0" distR="0" wp14:anchorId="77A783F9" wp14:editId="5BC12010">
+        <wp:inline distT="0" distB="0" distL="0" distR="0" wp14:anchorId="3DBEEAE0" wp14:editId="75BC75DD">
           <wp:extent cx="3048000" cy="3048000"/>
           <wp:effectExtent l="0" t="0" r="0" b="0"/>
-          <wp:docPr id="234636492" name="ThiqqahWaterMark"/>
+          <wp:docPr id="1090650887" name="ThiqqahWaterMark"/>
           <wp:cNvGraphicFramePr/>
           <a:graphic xmlns:a="http://schemas.openxmlformats.org/drawingml/2006/main">
             <a:graphicData uri="http://schemas.openxmlformats.org/drawingml/2006/picture">
               <pic:pic xmlns:pic="http://schemas.openxmlformats.org/drawingml/2006/picture">
                 <pic:nvPicPr>
-                  <pic:cNvPr id="234636492" name="ThiqqahWaterMark"/>
+                  <pic:cNvPr id="1090650887" name="ThiqqahWaterMark"/>
                   <pic:cNvPicPr/>
                 </pic:nvPicPr>
                 <pic:blipFill>
@@ -730,7 +730,7 @@
               <w:noProof/>
             </w:rPr>
             <w:drawing>
-              <wp:inline distT="0" distB="0" distL="0" distR="0" wp14:anchorId="41854603" wp14:editId="30DBB0F7">
+              <wp:inline distT="0" distB="0" distL="0" distR="0" wp14:anchorId="7A35D9BE" wp14:editId="7EEF5A5C">
                 <wp:extent cx="1128000" cy="251156"/>
                 <wp:effectExtent l="0" t="0" r="0" b="0"/>
                 <wp:docPr id="1" name="Picture 1"/>
@@ -965,31 +965,31 @@
       </w:rPr>
     </w:lvl>
   </w:abstractNum>
-  <w:num w:numId="1" w16cid:durableId="584342210">
+  <w:num w:numId="1" w16cid:durableId="1389378855">
     <w:abstractNumId w:val="8"/>
   </w:num>
-  <w:num w:numId="2" w16cid:durableId="1047215494">
+  <w:num w:numId="2" w16cid:durableId="1671326880">
     <w:abstractNumId w:val="6"/>
   </w:num>
-  <w:num w:numId="3" w16cid:durableId="1046370754">
+  <w:num w:numId="3" w16cid:durableId="1206943225">
     <w:abstractNumId w:val="5"/>
   </w:num>
-  <w:num w:numId="4" w16cid:durableId="374895118">
+  <w:num w:numId="4" w16cid:durableId="747847561">
     <w:abstractNumId w:val="4"/>
   </w:num>
-  <w:num w:numId="5" w16cid:durableId="177548890">
+  <w:num w:numId="5" w16cid:durableId="1331254473">
     <w:abstractNumId w:val="7"/>
   </w:num>
-  <w:num w:numId="6" w16cid:durableId="4796259">
+  <w:num w:numId="6" w16cid:durableId="1970083893">
     <w:abstractNumId w:val="3"/>
   </w:num>
-  <w:num w:numId="7" w16cid:durableId="211507291">
+  <w:num w:numId="7" w16cid:durableId="1302344492">
     <w:abstractNumId w:val="2"/>
   </w:num>
-  <w:num w:numId="8" w16cid:durableId="127624574">
+  <w:num w:numId="8" w16cid:durableId="1501700570">
     <w:abstractNumId w:val="1"/>
   </w:num>
-  <w:num w:numId="9" w16cid:durableId="1582329316">
+  <w:num w:numId="9" w16cid:durableId="336659866">
     <w:abstractNumId w:val="0"/>
   </w:num>
 </w:numbering>

</xml_diff>

<commit_message>
fix(thiqqah-letterhead): EN line breaks, full logo, fallbacks, Docx sync
- Split English name into 3 lines; drop justify/small-caps that caused bad wraps
- Use thiqqah-logo-full in JSON; wider header pad + docx logo width
- Default visible AR/EN/footer text if embed.js fails to load
- Tagline EN on two lines (CR + KSA)

Made-with: Cursor
</commit_message>
<xml_diff>
--- a/thiqqah-site/letterhead-thiqqah.docx
+++ b/thiqqah-site/letterhead-thiqqah.docx
@@ -258,10 +258,10 @@
               <w:noProof/>
             </w:rPr>
             <w:drawing>
-              <wp:inline distT="0" distB="0" distL="0" distR="0" wp14:anchorId="3F6A83DE" wp14:editId="7451ACA5">
+              <wp:inline distT="0" distB="0" distL="0" distR="0" wp14:anchorId="650A1759" wp14:editId="4F2E8D7E">
                 <wp:extent cx="522000" cy="522000"/>
                 <wp:effectExtent l="0" t="0" r="0" b="0"/>
-                <wp:docPr id="602565931" name="Picture 1"/>
+                <wp:docPr id="1196117649" name="Picture 1"/>
                 <wp:cNvGraphicFramePr>
                   <a:graphicFrameLocks xmlns:a="http://schemas.openxmlformats.org/drawingml/2006/main" noChangeAspect="1"/>
                 </wp:cNvGraphicFramePr>
@@ -336,16 +336,16 @@
         <w:noProof/>
       </w:rPr>
       <w:drawing>
-        <wp:inline distT="0" distB="0" distL="0" distR="0" wp14:anchorId="3DBEEAE0" wp14:editId="75BC75DD">
+        <wp:inline distT="0" distB="0" distL="0" distR="0" wp14:anchorId="2C73E890" wp14:editId="3398C6C0">
           <wp:extent cx="3048000" cy="3048000"/>
           <wp:effectExtent l="0" t="0" r="0" b="0"/>
-          <wp:docPr id="1090650887" name="ThiqqahWaterMark"/>
+          <wp:docPr id="1738679173" name="ThiqqahWaterMark"/>
           <wp:cNvGraphicFramePr/>
           <a:graphic xmlns:a="http://schemas.openxmlformats.org/drawingml/2006/main">
             <a:graphicData uri="http://schemas.openxmlformats.org/drawingml/2006/picture">
               <pic:pic xmlns:pic="http://schemas.openxmlformats.org/drawingml/2006/picture">
                 <pic:nvPicPr>
-                  <pic:cNvPr id="1090650887" name="ThiqqahWaterMark"/>
+                  <pic:cNvPr id="1738679173" name="ThiqqahWaterMark"/>
                   <pic:cNvPicPr/>
                 </pic:nvPicPr>
                 <pic:blipFill>
@@ -378,9 +378,9 @@
       <w:tblLook w:val="04A0" w:firstRow="1" w:lastRow="0" w:firstColumn="1" w:lastColumn="0" w:noHBand="0" w:noVBand="1"/>
     </w:tblPr>
     <w:tblGrid>
-      <w:gridCol w:w="3171"/>
-      <w:gridCol w:w="3175"/>
-      <w:gridCol w:w="3185"/>
+      <w:gridCol w:w="3170"/>
+      <w:gridCol w:w="3174"/>
+      <w:gridCol w:w="3187"/>
       <w:gridCol w:w="107"/>
     </w:tblGrid>
     <w:tr>
@@ -405,7 +405,17 @@
               <w:color w:val="0A665D"/>
               <w:sz w:val="17"/>
             </w:rPr>
-            <w:t>Al-Thiqqah Al-Dhahabiyah</w:t>
+            <w:t>Al-Thiqqah</w:t>
+          </w:r>
+          <w:r>
+            <w:rPr>
+              <w:rFonts w:ascii="Times New Roman" w:hAnsi="Times New Roman"/>
+              <w:noProof/>
+              <w:color w:val="0A665D"/>
+              <w:sz w:val="17"/>
+            </w:rPr>
+            <w:br/>
+            <w:t>Al-Dhahabiyah</w:t>
           </w:r>
           <w:r>
             <w:rPr>
@@ -425,7 +435,17 @@
               <w:sz w:val="17"/>
             </w:rPr>
             <w:br/>
-            <w:t>Commercial Registration No. 4030506321 · Kingdom of Saudi Arabia</w:t>
+            <w:t>Commercial Registration No. 4030506321</w:t>
+          </w:r>
+          <w:r>
+            <w:rPr>
+              <w:rFonts w:ascii="Times New Roman" w:hAnsi="Times New Roman"/>
+              <w:noProof/>
+              <w:color w:val="0A665D"/>
+              <w:sz w:val="17"/>
+            </w:rPr>
+            <w:br/>
+            <w:t>Kingdom of Saudi Arabia</w:t>
           </w:r>
         </w:p>
       </w:tc>
@@ -730,8 +750,8 @@
               <w:noProof/>
             </w:rPr>
             <w:drawing>
-              <wp:inline distT="0" distB="0" distL="0" distR="0" wp14:anchorId="7A35D9BE" wp14:editId="7EEF5A5C">
-                <wp:extent cx="1128000" cy="251156"/>
+              <wp:inline distT="0" distB="0" distL="0" distR="0" wp14:anchorId="6394C718" wp14:editId="5DA6DA1B">
+                <wp:extent cx="1206000" cy="853857"/>
                 <wp:effectExtent l="0" t="0" r="0" b="0"/>
                 <wp:docPr id="1" name="Picture 1"/>
                 <wp:cNvGraphicFramePr>
@@ -741,7 +761,7 @@
                   <a:graphicData uri="http://schemas.openxmlformats.org/drawingml/2006/picture">
                     <pic:pic xmlns:pic="http://schemas.openxmlformats.org/drawingml/2006/picture">
                       <pic:nvPicPr>
-                        <pic:cNvPr id="0" name="thiqqah-logo-emblem.png"/>
+                        <pic:cNvPr id="0" name="thiqqah-logo-full.png"/>
                         <pic:cNvPicPr/>
                       </pic:nvPicPr>
                       <pic:blipFill>
@@ -753,7 +773,7 @@
                       <pic:spPr>
                         <a:xfrm>
                           <a:off x="0" y="0"/>
-                          <a:ext cx="1128000" cy="251156"/>
+                          <a:ext cx="1206000" cy="853857"/>
                         </a:xfrm>
                         <a:prstGeom prst="rect">
                           <a:avLst/>
@@ -965,31 +985,31 @@
       </w:rPr>
     </w:lvl>
   </w:abstractNum>
-  <w:num w:numId="1" w16cid:durableId="1389378855">
+  <w:num w:numId="1" w16cid:durableId="1636907245">
     <w:abstractNumId w:val="8"/>
   </w:num>
-  <w:num w:numId="2" w16cid:durableId="1671326880">
+  <w:num w:numId="2" w16cid:durableId="1720322056">
     <w:abstractNumId w:val="6"/>
   </w:num>
-  <w:num w:numId="3" w16cid:durableId="1206943225">
+  <w:num w:numId="3" w16cid:durableId="1879732282">
     <w:abstractNumId w:val="5"/>
   </w:num>
-  <w:num w:numId="4" w16cid:durableId="747847561">
+  <w:num w:numId="4" w16cid:durableId="405884638">
     <w:abstractNumId w:val="4"/>
   </w:num>
-  <w:num w:numId="5" w16cid:durableId="1331254473">
+  <w:num w:numId="5" w16cid:durableId="1596791093">
     <w:abstractNumId w:val="7"/>
   </w:num>
-  <w:num w:numId="6" w16cid:durableId="1970083893">
+  <w:num w:numId="6" w16cid:durableId="1974602153">
     <w:abstractNumId w:val="3"/>
   </w:num>
-  <w:num w:numId="7" w16cid:durableId="1302344492">
+  <w:num w:numId="7" w16cid:durableId="1188331340">
     <w:abstractNumId w:val="2"/>
   </w:num>
-  <w:num w:numId="8" w16cid:durableId="1501700570">
+  <w:num w:numId="8" w16cid:durableId="805514812">
     <w:abstractNumId w:val="1"/>
   </w:num>
-  <w:num w:numId="9" w16cid:durableId="336659866">
+  <w:num w:numId="9" w16cid:durableId="2033919917">
     <w:abstractNumId w:val="0"/>
   </w:num>
 </w:numbering>

</xml_diff>

<commit_message>
feat(letterhead): balance watermark in body slot; Arabic firm name in footer
- Watermark centered in slot between header and footer (no edge clip)
- Footer: office name from nameAr + site + email + phone; wrap-safe
- Word footer matches (centered run line)

Made-with: Cursor
</commit_message>
<xml_diff>
--- a/thiqqah-site/letterhead-thiqqah.docx
+++ b/thiqqah-site/letterhead-thiqqah.docx
@@ -196,8 +196,79 @@
         <w:p>
           <w:pPr>
             <w:spacing w:after="0"/>
-            <w:jc w:val="both"/>
+            <w:jc w:val="center"/>
           </w:pPr>
+          <w:r>
+            <w:rPr>
+              <w:rFonts w:ascii="Arial" w:hAnsi="Arial"/>
+              <w:b/>
+              <w:color w:val="0A665D"/>
+              <w:sz w:val="17"/>
+            </w:rPr>
+            <w:t>مكتبثقة</w:t>
+          </w:r>
+          <w:r>
+            <w:rPr>
+              <w:rFonts w:ascii="Arial" w:hAnsi="Arial"/>
+              <w:b/>
+              <w:color w:val="0A665D"/>
+              <w:sz w:val="17"/>
+            </w:rPr>
+            <w:t xml:space="preserve"> </w:t>
+          </w:r>
+          <w:r>
+            <w:rPr>
+              <w:rFonts w:ascii="Arial" w:hAnsi="Arial"/>
+              <w:b/>
+              <w:color w:val="0A665D"/>
+              <w:sz w:val="17"/>
+            </w:rPr>
+            <w:t>الذهبية</w:t>
+          </w:r>
+          <w:r>
+            <w:rPr>
+              <w:rFonts w:ascii="Arial" w:hAnsi="Arial"/>
+              <w:b/>
+              <w:color w:val="0A665D"/>
+              <w:sz w:val="17"/>
+            </w:rPr>
+            <w:t xml:space="preserve"> </w:t>
+          </w:r>
+          <w:r>
+            <w:rPr>
+              <w:rFonts w:ascii="Arial" w:hAnsi="Arial"/>
+              <w:b/>
+              <w:color w:val="0A665D"/>
+              <w:sz w:val="17"/>
+            </w:rPr>
+            <w:t>للخدمات</w:t>
+          </w:r>
+          <w:r>
+            <w:rPr>
+              <w:rFonts w:ascii="Arial" w:hAnsi="Arial"/>
+              <w:b/>
+              <w:color w:val="0A665D"/>
+              <w:sz w:val="17"/>
+            </w:rPr>
+            <w:t xml:space="preserve"> </w:t>
+          </w:r>
+          <w:r>
+            <w:rPr>
+              <w:rFonts w:ascii="Arial" w:hAnsi="Arial"/>
+              <w:b/>
+              <w:color w:val="0A665D"/>
+              <w:sz w:val="17"/>
+            </w:rPr>
+            <w:t>العامة</w:t>
+          </w:r>
+          <w:r>
+            <w:rPr>
+              <w:rFonts w:ascii="Arial" w:hAnsi="Arial"/>
+              <w:color w:val="0A665D"/>
+              <w:sz w:val="17"/>
+            </w:rPr>
+            <w:t xml:space="preserve">   ·   </w:t>
+          </w:r>
           <w:r>
             <w:rPr>
               <w:rFonts w:ascii="Arial" w:hAnsi="Arial"/>
@@ -258,10 +329,10 @@
               <w:noProof/>
             </w:rPr>
             <w:drawing>
-              <wp:inline distT="0" distB="0" distL="0" distR="0" wp14:anchorId="650A1759" wp14:editId="4F2E8D7E">
+              <wp:inline distT="0" distB="0" distL="0" distR="0" wp14:anchorId="453A308D" wp14:editId="64656930">
                 <wp:extent cx="522000" cy="522000"/>
                 <wp:effectExtent l="0" t="0" r="0" b="0"/>
-                <wp:docPr id="1196117649" name="Picture 1"/>
+                <wp:docPr id="1035862545" name="Picture 1"/>
                 <wp:cNvGraphicFramePr>
                   <a:graphicFrameLocks xmlns:a="http://schemas.openxmlformats.org/drawingml/2006/main" noChangeAspect="1"/>
                 </wp:cNvGraphicFramePr>
@@ -336,16 +407,16 @@
         <w:noProof/>
       </w:rPr>
       <w:drawing>
-        <wp:inline distT="0" distB="0" distL="0" distR="0" wp14:anchorId="2C73E890" wp14:editId="3398C6C0">
+        <wp:inline distT="0" distB="0" distL="0" distR="0" wp14:anchorId="2FD7DE6A" wp14:editId="5BED4503">
           <wp:extent cx="3048000" cy="3048000"/>
           <wp:effectExtent l="0" t="0" r="0" b="0"/>
-          <wp:docPr id="1738679173" name="ThiqqahWaterMark"/>
+          <wp:docPr id="1172985752" name="ThiqqahWaterMark"/>
           <wp:cNvGraphicFramePr/>
           <a:graphic xmlns:a="http://schemas.openxmlformats.org/drawingml/2006/main">
             <a:graphicData uri="http://schemas.openxmlformats.org/drawingml/2006/picture">
               <pic:pic xmlns:pic="http://schemas.openxmlformats.org/drawingml/2006/picture">
                 <pic:nvPicPr>
-                  <pic:cNvPr id="1738679173" name="ThiqqahWaterMark"/>
+                  <pic:cNvPr id="1172985752" name="ThiqqahWaterMark"/>
                   <pic:cNvPicPr/>
                 </pic:nvPicPr>
                 <pic:blipFill>
@@ -750,7 +821,7 @@
               <w:noProof/>
             </w:rPr>
             <w:drawing>
-              <wp:inline distT="0" distB="0" distL="0" distR="0" wp14:anchorId="6394C718" wp14:editId="5DA6DA1B">
+              <wp:inline distT="0" distB="0" distL="0" distR="0" wp14:anchorId="570DAECF" wp14:editId="42F82898">
                 <wp:extent cx="1206000" cy="853857"/>
                 <wp:effectExtent l="0" t="0" r="0" b="0"/>
                 <wp:docPr id="1" name="Picture 1"/>
@@ -985,31 +1056,31 @@
       </w:rPr>
     </w:lvl>
   </w:abstractNum>
-  <w:num w:numId="1" w16cid:durableId="1636907245">
+  <w:num w:numId="1" w16cid:durableId="398091136">
     <w:abstractNumId w:val="8"/>
   </w:num>
-  <w:num w:numId="2" w16cid:durableId="1720322056">
+  <w:num w:numId="2" w16cid:durableId="1679842937">
     <w:abstractNumId w:val="6"/>
   </w:num>
-  <w:num w:numId="3" w16cid:durableId="1879732282">
+  <w:num w:numId="3" w16cid:durableId="1984578789">
     <w:abstractNumId w:val="5"/>
   </w:num>
-  <w:num w:numId="4" w16cid:durableId="405884638">
+  <w:num w:numId="4" w16cid:durableId="1461919611">
     <w:abstractNumId w:val="4"/>
   </w:num>
-  <w:num w:numId="5" w16cid:durableId="1596791093">
+  <w:num w:numId="5" w16cid:durableId="126171080">
     <w:abstractNumId w:val="7"/>
   </w:num>
-  <w:num w:numId="6" w16cid:durableId="1974602153">
+  <w:num w:numId="6" w16cid:durableId="546842612">
     <w:abstractNumId w:val="3"/>
   </w:num>
-  <w:num w:numId="7" w16cid:durableId="1188331340">
+  <w:num w:numId="7" w16cid:durableId="1964067950">
     <w:abstractNumId w:val="2"/>
   </w:num>
-  <w:num w:numId="8" w16cid:durableId="805514812">
+  <w:num w:numId="8" w16cid:durableId="388505297">
     <w:abstractNumId w:val="1"/>
   </w:num>
-  <w:num w:numId="9" w16cid:durableId="2033919917">
+  <w:num w:numId="9" w16cid:durableId="1202278644">
     <w:abstractNumId w:val="0"/>
   </w:num>
 </w:numbering>

</xml_diff>

<commit_message>
fix(letterhead): footer name color matches contacts; img watermark full glyph
- footer-name-ar: green-2 like links, RTL isolate + Arabic font (fixes mixed LTR line shaping)
- watermark: img + object-fit contain, max width/height in mm/% inside slot, no tilt
- slightly widen watermark slot margins

Made-with: Cursor
</commit_message>
<xml_diff>
--- a/thiqqah-site/letterhead-thiqqah.docx
+++ b/thiqqah-site/letterhead-thiqqah.docx
@@ -329,10 +329,10 @@
               <w:noProof/>
             </w:rPr>
             <w:drawing>
-              <wp:inline distT="0" distB="0" distL="0" distR="0" wp14:anchorId="453A308D" wp14:editId="64656930">
+              <wp:inline distT="0" distB="0" distL="0" distR="0" wp14:anchorId="1560CF8A" wp14:editId="3E0692E3">
                 <wp:extent cx="522000" cy="522000"/>
                 <wp:effectExtent l="0" t="0" r="0" b="0"/>
-                <wp:docPr id="1035862545" name="Picture 1"/>
+                <wp:docPr id="736624746" name="Picture 1"/>
                 <wp:cNvGraphicFramePr>
                   <a:graphicFrameLocks xmlns:a="http://schemas.openxmlformats.org/drawingml/2006/main" noChangeAspect="1"/>
                 </wp:cNvGraphicFramePr>
@@ -407,16 +407,16 @@
         <w:noProof/>
       </w:rPr>
       <w:drawing>
-        <wp:inline distT="0" distB="0" distL="0" distR="0" wp14:anchorId="2FD7DE6A" wp14:editId="5BED4503">
+        <wp:inline distT="0" distB="0" distL="0" distR="0" wp14:anchorId="3D70771C" wp14:editId="097EA312">
           <wp:extent cx="3048000" cy="3048000"/>
           <wp:effectExtent l="0" t="0" r="0" b="0"/>
-          <wp:docPr id="1172985752" name="ThiqqahWaterMark"/>
+          <wp:docPr id="87325377" name="ThiqqahWaterMark"/>
           <wp:cNvGraphicFramePr/>
           <a:graphic xmlns:a="http://schemas.openxmlformats.org/drawingml/2006/main">
             <a:graphicData uri="http://schemas.openxmlformats.org/drawingml/2006/picture">
               <pic:pic xmlns:pic="http://schemas.openxmlformats.org/drawingml/2006/picture">
                 <pic:nvPicPr>
-                  <pic:cNvPr id="1172985752" name="ThiqqahWaterMark"/>
+                  <pic:cNvPr id="87325377" name="ThiqqahWaterMark"/>
                   <pic:cNvPicPr/>
                 </pic:nvPicPr>
                 <pic:blipFill>
@@ -821,7 +821,7 @@
               <w:noProof/>
             </w:rPr>
             <w:drawing>
-              <wp:inline distT="0" distB="0" distL="0" distR="0" wp14:anchorId="570DAECF" wp14:editId="42F82898">
+              <wp:inline distT="0" distB="0" distL="0" distR="0" wp14:anchorId="0E3E3ED9" wp14:editId="04FDBDA3">
                 <wp:extent cx="1206000" cy="853857"/>
                 <wp:effectExtent l="0" t="0" r="0" b="0"/>
                 <wp:docPr id="1" name="Picture 1"/>
@@ -1056,31 +1056,31 @@
       </w:rPr>
     </w:lvl>
   </w:abstractNum>
-  <w:num w:numId="1" w16cid:durableId="398091136">
+  <w:num w:numId="1" w16cid:durableId="1344088349">
     <w:abstractNumId w:val="8"/>
   </w:num>
-  <w:num w:numId="2" w16cid:durableId="1679842937">
+  <w:num w:numId="2" w16cid:durableId="154080294">
     <w:abstractNumId w:val="6"/>
   </w:num>
-  <w:num w:numId="3" w16cid:durableId="1984578789">
+  <w:num w:numId="3" w16cid:durableId="1661736245">
     <w:abstractNumId w:val="5"/>
   </w:num>
-  <w:num w:numId="4" w16cid:durableId="1461919611">
+  <w:num w:numId="4" w16cid:durableId="550308645">
     <w:abstractNumId w:val="4"/>
   </w:num>
-  <w:num w:numId="5" w16cid:durableId="126171080">
+  <w:num w:numId="5" w16cid:durableId="227689648">
     <w:abstractNumId w:val="7"/>
   </w:num>
-  <w:num w:numId="6" w16cid:durableId="546842612">
+  <w:num w:numId="6" w16cid:durableId="1309045074">
     <w:abstractNumId w:val="3"/>
   </w:num>
-  <w:num w:numId="7" w16cid:durableId="1964067950">
+  <w:num w:numId="7" w16cid:durableId="1837066577">
     <w:abstractNumId w:val="2"/>
   </w:num>
-  <w:num w:numId="8" w16cid:durableId="388505297">
+  <w:num w:numId="8" w16cid:durableId="362899667">
     <w:abstractNumId w:val="1"/>
   </w:num>
-  <w:num w:numId="9" w16cid:durableId="1202278644">
+  <w:num w:numId="9" w16cid:durableId="1749812588">
     <w:abstractNumId w:val="0"/>
   </w:num>
 </w:numbering>

</xml_diff>